<commit_message>
Update architecture/reference docs for POC completion plan A1-D6 (live-verified); flag Supabase RLS disabled on all 41 tables (C4)
</commit_message>
<xml_diff>
--- a/design-docs/BD_Platform_PRD_v1.3.docx
+++ b/design-docs/BD_Platform_PRD_v1.3.docx
@@ -1866,7 +1866,7 @@
                 <w:b w:val="false"/>
                 <w:bCs w:val="false"/>
               </w:rPr>
-              <w:t xml:space="preserve">Currently implemented as 'analyst'; rename pending</w:t>
+              <w:t>Renamed to standard_user (migration 012, 2026-06-13); no legacy alias</w:t>
             </w:r>
           </w:p>
         </w:tc>
@@ -2517,7 +2517,7 @@
                 <w:b w:val="false"/>
                 <w:bCs w:val="false"/>
               </w:rPr>
-              <w:t xml:space="preserve">Four roles: bd_lead, proposal_manager, standard_user (today: analyst), admin. Role enforced on every API endpoint.</w:t>
+              <w:t>Four roles: bd_lead, proposal_manager, standard_user, admin. Role enforced on every API endpoint.</w:t>
             </w:r>
           </w:p>
         </w:tc>
@@ -2595,7 +2595,7 @@
                 <w:b w:val="false"/>
                 <w:bCs w:val="false"/>
               </w:rPr>
-              <w:t xml:space="preserve">Partial</w:t>
+              <w:t>Built</w:t>
             </w:r>
           </w:p>
         </w:tc>
@@ -3552,7 +3552,7 @@
                 <w:b w:val="false"/>
                 <w:bCs w:val="false"/>
               </w:rPr>
-              <w:t xml:space="preserve">Partial</w:t>
+              <w:t>Built</w:t>
             </w:r>
           </w:p>
         </w:tc>
@@ -4080,7 +4080,7 @@
                 <w:b w:val="false"/>
                 <w:bCs w:val="false"/>
               </w:rPr>
-              <w:t xml:space="preserve">Partial</w:t>
+              <w:t>Built</w:t>
             </w:r>
           </w:p>
         </w:tc>
@@ -7186,7 +7186,7 @@
         <w:spacing w:after="120"/>
       </w:pPr>
       <w:r>
-        <w:t xml:space="preserve">The platform uses a relational PostgreSQL database with 39 tables (verified against the live schema, June 2026). All entities include created_at and updated_at timestamps and foreign key constraints. The authoritative schema lives at /database/schema.sql plus migration files.</w:t>
+        <w:t>The platform uses a relational PostgreSQL database with 41 tables (verified against the live schema, June 2026). All entities include created_at and updated_at timestamps and foreign key constraints. The authoritative schema lives at /database/schema.sql plus migration files.</w:t>
       </w:r>
     </w:p>
     <w:p>
@@ -7452,7 +7452,7 @@
         <w:spacing w:after="120"/>
       </w:pPr>
       <w:r>
-        <w:t xml:space="preserve">Deal reviews (Step 2/3 records and weighted scoring), capture context sub-tables (profile, milestones, incumbent, status updates), admin action queue, password reset tokens, and supporting tables. See schema and migrations for the authoritative list.</w:t>
+        <w:t>Deal reviews (Step 2/3 records and weighted scoring), capture context sub-tables (profile, milestones, incumbent, status updates), deal_step2_checklist, deal_swb, admin action queue, password reset tokens, and supporting tables. See schema and migrations for the authoritative list.</w:t>
       </w:r>
     </w:p>
     <w:p>
@@ -7780,7 +7780,7 @@
                 <w:b w:val="false"/>
                 <w:bCs w:val="false"/>
               </w:rPr>
-              <w:t xml:space="preserve">PostgreSQL 17 — 39 tables</w:t>
+              <w:t>PostgreSQL 17 — 41 tables</w:t>
             </w:r>
           </w:p>
         </w:tc>

</xml_diff>